<commit_message>
Humanizer v2 pass: tighten prose, remove remaining AI patterns
- Remove em dash overuse, -ing superficial phrases, copula avoidance
- Shorten computational cost section (remove "orders of magnitude")
- Tighten conclusion opening and failure mode descriptions
- Cover letter: use first person, shorter sentences, less formulaic
- Regenerate cover_letter.docx

Co-Authored-By: Claude Opus 4.6 (1M context) <noreply@anthropic.com>
</commit_message>
<xml_diff>
--- a/docs/cover_letter.docx
+++ b/docs/cover_letter.docx
@@ -44,7 +44,7 @@
         <w:pStyle w:val="BodyText"/>
       </w:pPr>
       <w:r>
-        <w:t xml:space="preserve">Indoor airflow simulation by CFD is a standard diagnostic tool in building science, but its use in routine energy audits and post-occupancy assessments is rare because constructing a 3D geometric model from site drawings or photographs takes hours of CAD work. This manuscript shows that a vision-language model (VLM) can extract a structured 3D scene description from a single 2D image with enough accuracy to produce a physically meaningful CFD solution. No prior study has evaluated VLM spatial perception against downstream CFD accuracy, and no controlled benchmark has existed for this purpose.</w:t>
+        <w:t xml:space="preserve">CFD is a standard tool for indoor airflow diagnostics, yet it is rarely used in routine energy audits because the 3D geometry has to be built by hand from drawings or photos, which takes hours of CAD work. This manuscript shows that a vision-language model can extract a 3D scene description from a single image accurately enough to produce a physically meaningful CFD solution. To my knowledge, no prior work has tested VLM spatial perception against downstream CFD accuracy with a controlled benchmark.</w:t>
       </w:r>
     </w:p>
     <w:p>
@@ -52,7 +52,7 @@
         <w:pStyle w:val="BodyText"/>
       </w:pPr>
       <w:r>
-        <w:t xml:space="preserve">The study provides a 100-case benchmark (20 geometries at four complexity levels, each rendered in five view types) with independently computed reference CFD solutions free of VLM data leakage. Two complementary metrics quantify geometric fidelity and flow-field accuracy separately, and three systematic failure modes are identified that define where the approach works and where it breaks down. The solver is independently validated against the Nielsen et al. (1978) ventilated room experiment using laser Doppler anemometry data. The pipeline, benchmark, and evaluation code are publicly available.</w:t>
+        <w:t xml:space="preserve">The study uses a 100-case benchmark (20 geometries at four complexity levels, five view types each) with reference CFD solutions computed independently of the VLM. Geometric fidelity and flow-field accuracy are scored separately, which revealed that a geometrically accurate prediction does not guarantee a good CFD match — an important finding for setting realistic expectations. Three systematic failure modes define where the approach works and where it breaks down. The solver is validated against the Nielsen et al. (1978) ventilated room experiment, and the full pipeline and benchmark are publicly available.</w:t>
       </w:r>
     </w:p>
     <w:p>
@@ -60,7 +60,7 @@
         <w:pStyle w:val="BodyText"/>
       </w:pPr>
       <w:r>
-        <w:t xml:space="preserve">Building and Environment publishes work on indoor air quality simulation, CFD-based ventilation analysis, and computational tools for the built environment. This manuscript introduces a computational approach that could make CFD screening accessible to practitioners without CAD expertise, and should interest readers working on AI-assisted building performance analysis.</w:t>
+        <w:t xml:space="preserve">I believe this work fits Building and Environment because it sits at the intersection of indoor CFD simulation and computational tools for the built environment. The approach could make airflow screening accessible to practitioners who currently lack the CAD skills or time to prepare geometry models by hand.</w:t>
       </w:r>
     </w:p>
     <w:p>

</xml_diff>